<commit_message>
Inclui assinaturas, Ronaldo Barbosa Ribeiro e versão em PDF da lista de presença
Assinaturas recortadas da folha escaneada e aplicadas na coluna de
assinatura; adicionado RONALDO BARBOSA RIBEIRO (846.330.937-20) entre
Daniel Picanço e Julio Cesar; gerado PDF digital a partir do Word.

Co-Authored-By: Claude Opus 5.5 <noreply@anthropic.com>
Claude-Session: https://claude.ai/code/session_01PFoK9wuqP3Vu4poGin2NSm
</commit_message>
<xml_diff>
--- a/LISTA DE PRESENÇA - TREINAMENTO - GDA - AREA CLASSIFICADA - 19-11-2025.docx
+++ b/LISTA DE PRESENÇA - TREINAMENTO - GDA - AREA CLASSIFICADA - 19-11-2025.docx
@@ -996,7 +996,6 @@
             <w:r>
               <w:rPr>
                 <w:sz w:val="24"/>
-                <w:szCs w:val="24"/>
                 <w:lang w:val="pt-BR"/>
               </w:rPr>
               <w:t>GILSINEI DE MENEZES SANTOS</w:t>
@@ -1025,7 +1024,6 @@
             <w:r>
               <w:rPr>
                 <w:sz w:val="24"/>
-                <w:szCs w:val="24"/>
                 <w:lang w:val="pt-BR"/>
               </w:rPr>
               <w:t>098.640.237-05</w:t>
@@ -1048,6 +1046,47 @@
                 <w:lang w:val="pt-BR"/>
               </w:rPr>
             </w:pPr>
+            <w:r>
+              <w:drawing>
+                <wp:anchor distT="0" distB="0" distL="0" distR="0" simplePos="0" relativeHeight="251660901" behindDoc="0" locked="0" layoutInCell="1" allowOverlap="1">
+                  <wp:simplePos x="0" y="0"/>
+                  <wp:positionH relativeFrom="column">
+                    <wp:posOffset>91440</wp:posOffset>
+                  </wp:positionH>
+                  <wp:positionV relativeFrom="paragraph">
+                    <wp:posOffset>14418</wp:posOffset>
+                  </wp:positionV>
+                  <wp:extent cx="580848" cy="134839"/>
+                  <wp:effectExtent l="0" t="0" r="0" b="0"/>
+                  <wp:wrapNone/>
+                  <wp:docPr id="901" name="Assinatura Gilsinei De Menezes Santos"/>
+                  <wp:cNvGraphicFramePr/>
+                  <a:graphic xmlns:a="http://schemas.openxmlformats.org/drawingml/2006/main" xmlns:pic="http://schemas.openxmlformats.org/drawingml/2006/picture">
+                    <a:graphicData uri="http://schemas.openxmlformats.org/drawingml/2006/picture">
+                      <pic:pic>
+                        <pic:nvPicPr>
+                          <pic:cNvPr id="0" name="sig_GIL.png"/>
+                          <pic:cNvPicPr/>
+                        </pic:nvPicPr>
+                        <pic:blipFill>
+                          <a:blip r:embed="rId12"/>
+                          <a:stretch>
+                            <a:fillRect/>
+                          </a:stretch>
+                        </pic:blipFill>
+                        <pic:spPr>
+                          <a:xfrm>
+                            <a:off x="0" y="0"/>
+                            <a:ext cx="580848" cy="134839"/>
+                          </a:xfrm>
+                          <a:prstGeom prst="rect"/>
+                        </pic:spPr>
+                      </pic:pic>
+                    </a:graphicData>
+                  </a:graphic>
+                </wp:anchor>
+              </w:drawing>
+            </w:r>
           </w:p>
         </w:tc>
       </w:tr>
@@ -1084,7 +1123,6 @@
             <w:r>
               <w:rPr>
                 <w:sz w:val="24"/>
-                <w:szCs w:val="24"/>
                 <w:lang w:val="pt-BR"/>
               </w:rPr>
               <w:t>GABRIEL ANCELMO SOARES</w:t>
@@ -1113,7 +1151,6 @@
             <w:r>
               <w:rPr>
                 <w:sz w:val="24"/>
-                <w:szCs w:val="24"/>
                 <w:lang w:val="pt-BR"/>
               </w:rPr>
               <w:t>179.216.077-13</w:t>
@@ -1136,6 +1173,47 @@
                 <w:lang w:val="pt-BR"/>
               </w:rPr>
             </w:pPr>
+            <w:r>
+              <w:drawing>
+                <wp:anchor distT="0" distB="0" distL="0" distR="0" simplePos="0" relativeHeight="251660902" behindDoc="0" locked="0" layoutInCell="1" allowOverlap="1">
+                  <wp:simplePos x="0" y="0"/>
+                  <wp:positionH relativeFrom="column">
+                    <wp:posOffset>91440</wp:posOffset>
+                  </wp:positionH>
+                  <wp:positionV relativeFrom="paragraph">
+                    <wp:posOffset>0</wp:posOffset>
+                  </wp:positionV>
+                  <wp:extent cx="1732173" cy="181515"/>
+                  <wp:effectExtent l="0" t="0" r="0" b="0"/>
+                  <wp:wrapNone/>
+                  <wp:docPr id="902" name="Assinatura Gabriel Ancelmo Soares"/>
+                  <wp:cNvGraphicFramePr/>
+                  <a:graphic xmlns:a="http://schemas.openxmlformats.org/drawingml/2006/main" xmlns:pic="http://schemas.openxmlformats.org/drawingml/2006/picture">
+                    <a:graphicData uri="http://schemas.openxmlformats.org/drawingml/2006/picture">
+                      <pic:pic>
+                        <pic:nvPicPr>
+                          <pic:cNvPr id="0" name="sig_GAB.png"/>
+                          <pic:cNvPicPr/>
+                        </pic:nvPicPr>
+                        <pic:blipFill>
+                          <a:blip r:embed="rId13"/>
+                          <a:stretch>
+                            <a:fillRect/>
+                          </a:stretch>
+                        </pic:blipFill>
+                        <pic:spPr>
+                          <a:xfrm>
+                            <a:off x="0" y="0"/>
+                            <a:ext cx="1732173" cy="181515"/>
+                          </a:xfrm>
+                          <a:prstGeom prst="rect"/>
+                        </pic:spPr>
+                      </pic:pic>
+                    </a:graphicData>
+                  </a:graphic>
+                </wp:anchor>
+              </w:drawing>
+            </w:r>
           </w:p>
         </w:tc>
       </w:tr>
@@ -1172,7 +1250,6 @@
             <w:r>
               <w:rPr>
                 <w:sz w:val="24"/>
-                <w:szCs w:val="24"/>
                 <w:lang w:val="pt-BR"/>
               </w:rPr>
               <w:t>MARCOS VICTOR RODRIGUES DOS SANTOS</w:t>
@@ -1201,7 +1278,6 @@
             <w:r>
               <w:rPr>
                 <w:sz w:val="24"/>
-                <w:szCs w:val="24"/>
                 <w:lang w:val="pt-BR"/>
               </w:rPr>
               <w:t>063.220.197-59</w:t>
@@ -1224,6 +1300,47 @@
                 <w:lang w:val="pt-BR"/>
               </w:rPr>
             </w:pPr>
+            <w:r>
+              <w:drawing>
+                <wp:anchor distT="0" distB="0" distL="0" distR="0" simplePos="0" relativeHeight="251660903" behindDoc="0" locked="0" layoutInCell="1" allowOverlap="1">
+                  <wp:simplePos x="0" y="0"/>
+                  <wp:positionH relativeFrom="column">
+                    <wp:posOffset>91440</wp:posOffset>
+                  </wp:positionH>
+                  <wp:positionV relativeFrom="paragraph">
+                    <wp:posOffset>156</wp:posOffset>
+                  </wp:positionV>
+                  <wp:extent cx="523801" cy="163363"/>
+                  <wp:effectExtent l="0" t="0" r="0" b="0"/>
+                  <wp:wrapNone/>
+                  <wp:docPr id="903" name="Assinatura Marcos Victor Rodrigues Dos Santos"/>
+                  <wp:cNvGraphicFramePr/>
+                  <a:graphic xmlns:a="http://schemas.openxmlformats.org/drawingml/2006/main" xmlns:pic="http://schemas.openxmlformats.org/drawingml/2006/picture">
+                    <a:graphicData uri="http://schemas.openxmlformats.org/drawingml/2006/picture">
+                      <pic:pic>
+                        <pic:nvPicPr>
+                          <pic:cNvPr id="0" name="sig_MAR.png"/>
+                          <pic:cNvPicPr/>
+                        </pic:nvPicPr>
+                        <pic:blipFill>
+                          <a:blip r:embed="rId14"/>
+                          <a:stretch>
+                            <a:fillRect/>
+                          </a:stretch>
+                        </pic:blipFill>
+                        <pic:spPr>
+                          <a:xfrm>
+                            <a:off x="0" y="0"/>
+                            <a:ext cx="523801" cy="163363"/>
+                          </a:xfrm>
+                          <a:prstGeom prst="rect"/>
+                        </pic:spPr>
+                      </pic:pic>
+                    </a:graphicData>
+                  </a:graphic>
+                </wp:anchor>
+              </w:drawing>
+            </w:r>
           </w:p>
         </w:tc>
       </w:tr>
@@ -1260,7 +1377,6 @@
             <w:r>
               <w:rPr>
                 <w:sz w:val="24"/>
-                <w:szCs w:val="24"/>
                 <w:lang w:val="pt-BR"/>
               </w:rPr>
               <w:t>WAGNER SANTANA FELIX PEREIRA</w:t>
@@ -1289,7 +1405,6 @@
             <w:r>
               <w:rPr>
                 <w:sz w:val="24"/>
-                <w:szCs w:val="24"/>
                 <w:lang w:val="pt-BR"/>
               </w:rPr>
               <w:t>152.960.607-17</w:t>
@@ -1312,6 +1427,47 @@
                 <w:lang w:val="pt-BR"/>
               </w:rPr>
             </w:pPr>
+            <w:r>
+              <w:drawing>
+                <wp:anchor distT="0" distB="0" distL="0" distR="0" simplePos="0" relativeHeight="251660904" behindDoc="0" locked="0" layoutInCell="1" allowOverlap="1">
+                  <wp:simplePos x="0" y="0"/>
+                  <wp:positionH relativeFrom="column">
+                    <wp:posOffset>91440</wp:posOffset>
+                  </wp:positionH>
+                  <wp:positionV relativeFrom="paragraph">
+                    <wp:posOffset>0</wp:posOffset>
+                  </wp:positionV>
+                  <wp:extent cx="899796" cy="168549"/>
+                  <wp:effectExtent l="0" t="0" r="0" b="0"/>
+                  <wp:wrapNone/>
+                  <wp:docPr id="904" name="Assinatura Wagner Santana Felix Pereira"/>
+                  <wp:cNvGraphicFramePr/>
+                  <a:graphic xmlns:a="http://schemas.openxmlformats.org/drawingml/2006/main" xmlns:pic="http://schemas.openxmlformats.org/drawingml/2006/picture">
+                    <a:graphicData uri="http://schemas.openxmlformats.org/drawingml/2006/picture">
+                      <pic:pic>
+                        <pic:nvPicPr>
+                          <pic:cNvPr id="0" name="sig_WAG.png"/>
+                          <pic:cNvPicPr/>
+                        </pic:nvPicPr>
+                        <pic:blipFill>
+                          <a:blip r:embed="rId15"/>
+                          <a:stretch>
+                            <a:fillRect/>
+                          </a:stretch>
+                        </pic:blipFill>
+                        <pic:spPr>
+                          <a:xfrm>
+                            <a:off x="0" y="0"/>
+                            <a:ext cx="899796" cy="168549"/>
+                          </a:xfrm>
+                          <a:prstGeom prst="rect"/>
+                        </pic:spPr>
+                      </pic:pic>
+                    </a:graphicData>
+                  </a:graphic>
+                </wp:anchor>
+              </w:drawing>
+            </w:r>
           </w:p>
         </w:tc>
       </w:tr>
@@ -1348,7 +1504,6 @@
             <w:r>
               <w:rPr>
                 <w:sz w:val="24"/>
-                <w:szCs w:val="24"/>
                 <w:lang w:val="pt-BR"/>
               </w:rPr>
               <w:t>THASSARY DIAS DA LUZ</w:t>
@@ -1377,7 +1532,6 @@
             <w:r>
               <w:rPr>
                 <w:sz w:val="24"/>
-                <w:szCs w:val="24"/>
                 <w:lang w:val="pt-BR"/>
               </w:rPr>
               <w:t>124.592.816-33</w:t>
@@ -1400,6 +1554,47 @@
                 <w:lang w:val="pt-BR"/>
               </w:rPr>
             </w:pPr>
+            <w:r>
+              <w:drawing>
+                <wp:anchor distT="0" distB="0" distL="0" distR="0" simplePos="0" relativeHeight="251660905" behindDoc="0" locked="0" layoutInCell="1" allowOverlap="1">
+                  <wp:simplePos x="0" y="0"/>
+                  <wp:positionH relativeFrom="column">
+                    <wp:posOffset>91440</wp:posOffset>
+                  </wp:positionH>
+                  <wp:positionV relativeFrom="paragraph">
+                    <wp:posOffset>0</wp:posOffset>
+                  </wp:positionV>
+                  <wp:extent cx="1475459" cy="251528"/>
+                  <wp:effectExtent l="0" t="0" r="0" b="0"/>
+                  <wp:wrapNone/>
+                  <wp:docPr id="905" name="Assinatura Thassary Dias Da Luz"/>
+                  <wp:cNvGraphicFramePr/>
+                  <a:graphic xmlns:a="http://schemas.openxmlformats.org/drawingml/2006/main" xmlns:pic="http://schemas.openxmlformats.org/drawingml/2006/picture">
+                    <a:graphicData uri="http://schemas.openxmlformats.org/drawingml/2006/picture">
+                      <pic:pic>
+                        <pic:nvPicPr>
+                          <pic:cNvPr id="0" name="sig_THA.png"/>
+                          <pic:cNvPicPr/>
+                        </pic:nvPicPr>
+                        <pic:blipFill>
+                          <a:blip r:embed="rId16"/>
+                          <a:stretch>
+                            <a:fillRect/>
+                          </a:stretch>
+                        </pic:blipFill>
+                        <pic:spPr>
+                          <a:xfrm>
+                            <a:off x="0" y="0"/>
+                            <a:ext cx="1475459" cy="251528"/>
+                          </a:xfrm>
+                          <a:prstGeom prst="rect"/>
+                        </pic:spPr>
+                      </pic:pic>
+                    </a:graphicData>
+                  </a:graphic>
+                </wp:anchor>
+              </w:drawing>
+            </w:r>
           </w:p>
         </w:tc>
       </w:tr>
@@ -1436,7 +1631,6 @@
             <w:r>
               <w:rPr>
                 <w:sz w:val="24"/>
-                <w:szCs w:val="24"/>
                 <w:lang w:val="pt-BR"/>
               </w:rPr>
               <w:t>MATHEUS DIAS DOS REIS</w:t>
@@ -1465,7 +1659,6 @@
             <w:r>
               <w:rPr>
                 <w:sz w:val="24"/>
-                <w:szCs w:val="24"/>
                 <w:lang w:val="pt-BR"/>
               </w:rPr>
               <w:t>156.412.967-59</w:t>
@@ -1488,6 +1681,47 @@
                 <w:lang w:val="pt-BR"/>
               </w:rPr>
             </w:pPr>
+            <w:r>
+              <w:drawing>
+                <wp:anchor distT="0" distB="0" distL="0" distR="0" simplePos="0" relativeHeight="251660906" behindDoc="0" locked="0" layoutInCell="1" allowOverlap="1">
+                  <wp:simplePos x="0" y="0"/>
+                  <wp:positionH relativeFrom="column">
+                    <wp:posOffset>91440</wp:posOffset>
+                  </wp:positionH>
+                  <wp:positionV relativeFrom="paragraph">
+                    <wp:posOffset>11824</wp:posOffset>
+                  </wp:positionV>
+                  <wp:extent cx="350065" cy="140026"/>
+                  <wp:effectExtent l="0" t="0" r="0" b="0"/>
+                  <wp:wrapNone/>
+                  <wp:docPr id="906" name="Assinatura Matheus Dias Dos Reis"/>
+                  <wp:cNvGraphicFramePr/>
+                  <a:graphic xmlns:a="http://schemas.openxmlformats.org/drawingml/2006/main" xmlns:pic="http://schemas.openxmlformats.org/drawingml/2006/picture">
+                    <a:graphicData uri="http://schemas.openxmlformats.org/drawingml/2006/picture">
+                      <pic:pic>
+                        <pic:nvPicPr>
+                          <pic:cNvPr id="0" name="sig_MAT.png"/>
+                          <pic:cNvPicPr/>
+                        </pic:nvPicPr>
+                        <pic:blipFill>
+                          <a:blip r:embed="rId17"/>
+                          <a:stretch>
+                            <a:fillRect/>
+                          </a:stretch>
+                        </pic:blipFill>
+                        <pic:spPr>
+                          <a:xfrm>
+                            <a:off x="0" y="0"/>
+                            <a:ext cx="350065" cy="140026"/>
+                          </a:xfrm>
+                          <a:prstGeom prst="rect"/>
+                        </pic:spPr>
+                      </pic:pic>
+                    </a:graphicData>
+                  </a:graphic>
+                </wp:anchor>
+              </w:drawing>
+            </w:r>
           </w:p>
         </w:tc>
       </w:tr>
@@ -1524,7 +1758,6 @@
             <w:r>
               <w:rPr>
                 <w:sz w:val="24"/>
-                <w:szCs w:val="24"/>
                 <w:lang w:val="pt-BR"/>
               </w:rPr>
               <w:t>MAX RAMOS DA SILVA</w:t>
@@ -1553,7 +1786,6 @@
             <w:r>
               <w:rPr>
                 <w:sz w:val="24"/>
-                <w:szCs w:val="24"/>
                 <w:lang w:val="pt-BR"/>
               </w:rPr>
               <w:t>146.475.727-57</w:t>
@@ -1576,6 +1808,47 @@
                 <w:lang w:val="pt-BR"/>
               </w:rPr>
             </w:pPr>
+            <w:r>
+              <w:drawing>
+                <wp:anchor distT="0" distB="0" distL="0" distR="0" simplePos="0" relativeHeight="251660907" behindDoc="0" locked="0" layoutInCell="1" allowOverlap="1">
+                  <wp:simplePos x="0" y="0"/>
+                  <wp:positionH relativeFrom="column">
+                    <wp:posOffset>91440</wp:posOffset>
+                  </wp:positionH>
+                  <wp:positionV relativeFrom="paragraph">
+                    <wp:posOffset>0</wp:posOffset>
+                  </wp:positionV>
+                  <wp:extent cx="484904" cy="259307"/>
+                  <wp:effectExtent l="0" t="0" r="0" b="0"/>
+                  <wp:wrapNone/>
+                  <wp:docPr id="907" name="Assinatura Max Ramos Da Silva"/>
+                  <wp:cNvGraphicFramePr/>
+                  <a:graphic xmlns:a="http://schemas.openxmlformats.org/drawingml/2006/main" xmlns:pic="http://schemas.openxmlformats.org/drawingml/2006/picture">
+                    <a:graphicData uri="http://schemas.openxmlformats.org/drawingml/2006/picture">
+                      <pic:pic>
+                        <pic:nvPicPr>
+                          <pic:cNvPr id="0" name="sig_MAX.png"/>
+                          <pic:cNvPicPr/>
+                        </pic:nvPicPr>
+                        <pic:blipFill>
+                          <a:blip r:embed="rId18"/>
+                          <a:stretch>
+                            <a:fillRect/>
+                          </a:stretch>
+                        </pic:blipFill>
+                        <pic:spPr>
+                          <a:xfrm>
+                            <a:off x="0" y="0"/>
+                            <a:ext cx="484904" cy="259307"/>
+                          </a:xfrm>
+                          <a:prstGeom prst="rect"/>
+                        </pic:spPr>
+                      </pic:pic>
+                    </a:graphicData>
+                  </a:graphic>
+                </wp:anchor>
+              </w:drawing>
+            </w:r>
           </w:p>
         </w:tc>
       </w:tr>
@@ -1612,7 +1885,6 @@
             <w:r>
               <w:rPr>
                 <w:sz w:val="24"/>
-                <w:szCs w:val="24"/>
                 <w:lang w:val="pt-BR"/>
               </w:rPr>
               <w:t>MICHEL MARTINS MOTE</w:t>
@@ -1641,7 +1913,6 @@
             <w:r>
               <w:rPr>
                 <w:sz w:val="24"/>
-                <w:szCs w:val="24"/>
                 <w:lang w:val="pt-BR"/>
               </w:rPr>
               <w:t>148.482.137-89</w:t>
@@ -1664,6 +1935,47 @@
                 <w:lang w:val="pt-BR"/>
               </w:rPr>
             </w:pPr>
+            <w:r>
+              <w:drawing>
+                <wp:anchor distT="0" distB="0" distL="0" distR="0" simplePos="0" relativeHeight="251660908" behindDoc="0" locked="0" layoutInCell="1" allowOverlap="1">
+                  <wp:simplePos x="0" y="0"/>
+                  <wp:positionH relativeFrom="column">
+                    <wp:posOffset>91440</wp:posOffset>
+                  </wp:positionH>
+                  <wp:positionV relativeFrom="paragraph">
+                    <wp:posOffset>156</wp:posOffset>
+                  </wp:positionV>
+                  <wp:extent cx="391554" cy="163363"/>
+                  <wp:effectExtent l="0" t="0" r="0" b="0"/>
+                  <wp:wrapNone/>
+                  <wp:docPr id="908" name="Assinatura Michel Martins Mote"/>
+                  <wp:cNvGraphicFramePr/>
+                  <a:graphic xmlns:a="http://schemas.openxmlformats.org/drawingml/2006/main" xmlns:pic="http://schemas.openxmlformats.org/drawingml/2006/picture">
+                    <a:graphicData uri="http://schemas.openxmlformats.org/drawingml/2006/picture">
+                      <pic:pic>
+                        <pic:nvPicPr>
+                          <pic:cNvPr id="0" name="sig_MIC.png"/>
+                          <pic:cNvPicPr/>
+                        </pic:nvPicPr>
+                        <pic:blipFill>
+                          <a:blip r:embed="rId19"/>
+                          <a:stretch>
+                            <a:fillRect/>
+                          </a:stretch>
+                        </pic:blipFill>
+                        <pic:spPr>
+                          <a:xfrm>
+                            <a:off x="0" y="0"/>
+                            <a:ext cx="391554" cy="163363"/>
+                          </a:xfrm>
+                          <a:prstGeom prst="rect"/>
+                        </pic:spPr>
+                      </pic:pic>
+                    </a:graphicData>
+                  </a:graphic>
+                </wp:anchor>
+              </w:drawing>
+            </w:r>
           </w:p>
         </w:tc>
       </w:tr>
@@ -1700,7 +2012,6 @@
             <w:r>
               <w:rPr>
                 <w:sz w:val="24"/>
-                <w:szCs w:val="24"/>
                 <w:lang w:val="pt-BR"/>
               </w:rPr>
               <w:t>MIKAEL CARDOSO MUZY</w:t>
@@ -1729,7 +2040,6 @@
             <w:r>
               <w:rPr>
                 <w:sz w:val="24"/>
-                <w:szCs w:val="24"/>
                 <w:lang w:val="pt-BR"/>
               </w:rPr>
               <w:t>157.607.787-06</w:t>
@@ -1752,6 +2062,47 @@
                 <w:lang w:val="pt-BR"/>
               </w:rPr>
             </w:pPr>
+            <w:r>
+              <w:drawing>
+                <wp:anchor distT="0" distB="0" distL="0" distR="0" simplePos="0" relativeHeight="251660909" behindDoc="0" locked="0" layoutInCell="1" allowOverlap="1">
+                  <wp:simplePos x="0" y="0"/>
+                  <wp:positionH relativeFrom="column">
+                    <wp:posOffset>91440</wp:posOffset>
+                  </wp:positionH>
+                  <wp:positionV relativeFrom="paragraph">
+                    <wp:posOffset>156</wp:posOffset>
+                  </wp:positionV>
+                  <wp:extent cx="199666" cy="163363"/>
+                  <wp:effectExtent l="0" t="0" r="0" b="0"/>
+                  <wp:wrapNone/>
+                  <wp:docPr id="909" name="Assinatura Mikael Cardoso Muzy"/>
+                  <wp:cNvGraphicFramePr/>
+                  <a:graphic xmlns:a="http://schemas.openxmlformats.org/drawingml/2006/main" xmlns:pic="http://schemas.openxmlformats.org/drawingml/2006/picture">
+                    <a:graphicData uri="http://schemas.openxmlformats.org/drawingml/2006/picture">
+                      <pic:pic>
+                        <pic:nvPicPr>
+                          <pic:cNvPr id="0" name="sig_MIK.png"/>
+                          <pic:cNvPicPr/>
+                        </pic:nvPicPr>
+                        <pic:blipFill>
+                          <a:blip r:embed="rId20"/>
+                          <a:stretch>
+                            <a:fillRect/>
+                          </a:stretch>
+                        </pic:blipFill>
+                        <pic:spPr>
+                          <a:xfrm>
+                            <a:off x="0" y="0"/>
+                            <a:ext cx="199666" cy="163363"/>
+                          </a:xfrm>
+                          <a:prstGeom prst="rect"/>
+                        </pic:spPr>
+                      </pic:pic>
+                    </a:graphicData>
+                  </a:graphic>
+                </wp:anchor>
+              </w:drawing>
+            </w:r>
           </w:p>
         </w:tc>
       </w:tr>
@@ -1788,7 +2139,6 @@
             <w:r>
               <w:rPr>
                 <w:sz w:val="24"/>
-                <w:szCs w:val="24"/>
                 <w:lang w:val="pt-BR"/>
               </w:rPr>
               <w:t>ROGER HUDSON DE SOUZA</w:t>
@@ -1817,7 +2167,6 @@
             <w:r>
               <w:rPr>
                 <w:sz w:val="24"/>
-                <w:szCs w:val="24"/>
                 <w:lang w:val="pt-BR"/>
               </w:rPr>
               <w:t>141.012.667-60</w:t>
@@ -1840,6 +2189,47 @@
                 <w:lang w:val="pt-BR"/>
               </w:rPr>
             </w:pPr>
+            <w:r>
+              <w:drawing>
+                <wp:anchor distT="0" distB="0" distL="0" distR="0" simplePos="0" relativeHeight="251660910" behindDoc="0" locked="0" layoutInCell="1" allowOverlap="1">
+                  <wp:simplePos x="0" y="0"/>
+                  <wp:positionH relativeFrom="column">
+                    <wp:posOffset>91440</wp:posOffset>
+                  </wp:positionH>
+                  <wp:positionV relativeFrom="paragraph">
+                    <wp:posOffset>0</wp:posOffset>
+                  </wp:positionV>
+                  <wp:extent cx="730883" cy="192024"/>
+                  <wp:effectExtent l="0" t="0" r="0" b="0"/>
+                  <wp:wrapNone/>
+                  <wp:docPr id="910" name="Assinatura Roger Hudson De Souza"/>
+                  <wp:cNvGraphicFramePr/>
+                  <a:graphic xmlns:a="http://schemas.openxmlformats.org/drawingml/2006/main" xmlns:pic="http://schemas.openxmlformats.org/drawingml/2006/picture">
+                    <a:graphicData uri="http://schemas.openxmlformats.org/drawingml/2006/picture">
+                      <pic:pic>
+                        <pic:nvPicPr>
+                          <pic:cNvPr id="0" name="sig_ROG.png"/>
+                          <pic:cNvPicPr/>
+                        </pic:nvPicPr>
+                        <pic:blipFill>
+                          <a:blip r:embed="rId21"/>
+                          <a:stretch>
+                            <a:fillRect/>
+                          </a:stretch>
+                        </pic:blipFill>
+                        <pic:spPr>
+                          <a:xfrm>
+                            <a:off x="0" y="0"/>
+                            <a:ext cx="730883" cy="192024"/>
+                          </a:xfrm>
+                          <a:prstGeom prst="rect"/>
+                        </pic:spPr>
+                      </pic:pic>
+                    </a:graphicData>
+                  </a:graphic>
+                </wp:anchor>
+              </w:drawing>
+            </w:r>
           </w:p>
         </w:tc>
       </w:tr>
@@ -1876,7 +2266,6 @@
             <w:r>
               <w:rPr>
                 <w:sz w:val="24"/>
-                <w:szCs w:val="24"/>
                 <w:lang w:val="pt-BR"/>
               </w:rPr>
               <w:t>REDINSON FERREIRA SHERMAN</w:t>
@@ -1905,7 +2294,6 @@
             <w:r>
               <w:rPr>
                 <w:sz w:val="24"/>
-                <w:szCs w:val="24"/>
                 <w:lang w:val="pt-BR"/>
               </w:rPr>
               <w:t>056.384.447-77</w:t>
@@ -1928,6 +2316,47 @@
                 <w:lang w:val="pt-BR"/>
               </w:rPr>
             </w:pPr>
+            <w:r>
+              <w:drawing>
+                <wp:anchor distT="0" distB="0" distL="0" distR="0" simplePos="0" relativeHeight="251660911" behindDoc="0" locked="0" layoutInCell="1" allowOverlap="1">
+                  <wp:simplePos x="0" y="0"/>
+                  <wp:positionH relativeFrom="column">
+                    <wp:posOffset>91440</wp:posOffset>
+                  </wp:positionH>
+                  <wp:positionV relativeFrom="paragraph">
+                    <wp:posOffset>0</wp:posOffset>
+                  </wp:positionV>
+                  <wp:extent cx="1296537" cy="165956"/>
+                  <wp:effectExtent l="0" t="0" r="0" b="0"/>
+                  <wp:wrapNone/>
+                  <wp:docPr id="911" name="Assinatura Redinson Ferreira Sherman"/>
+                  <wp:cNvGraphicFramePr/>
+                  <a:graphic xmlns:a="http://schemas.openxmlformats.org/drawingml/2006/main" xmlns:pic="http://schemas.openxmlformats.org/drawingml/2006/picture">
+                    <a:graphicData uri="http://schemas.openxmlformats.org/drawingml/2006/picture">
+                      <pic:pic>
+                        <pic:nvPicPr>
+                          <pic:cNvPr id="0" name="sig_RED.png"/>
+                          <pic:cNvPicPr/>
+                        </pic:nvPicPr>
+                        <pic:blipFill>
+                          <a:blip r:embed="rId22"/>
+                          <a:stretch>
+                            <a:fillRect/>
+                          </a:stretch>
+                        </pic:blipFill>
+                        <pic:spPr>
+                          <a:xfrm>
+                            <a:off x="0" y="0"/>
+                            <a:ext cx="1296537" cy="165956"/>
+                          </a:xfrm>
+                          <a:prstGeom prst="rect"/>
+                        </pic:spPr>
+                      </pic:pic>
+                    </a:graphicData>
+                  </a:graphic>
+                </wp:anchor>
+              </w:drawing>
+            </w:r>
           </w:p>
         </w:tc>
       </w:tr>
@@ -1964,7 +2393,6 @@
             <w:r>
               <w:rPr>
                 <w:sz w:val="24"/>
-                <w:szCs w:val="24"/>
                 <w:lang w:val="pt-BR"/>
               </w:rPr>
               <w:t>DANIEL PICANÇO</w:t>
@@ -2042,10 +2470,9 @@
             <w:r>
               <w:rPr>
                 <w:sz w:val="24"/>
-                <w:szCs w:val="24"/>
-                <w:lang w:val="pt-BR"/>
-              </w:rPr>
-              <w:t>JULIO CESAR GUERRA VENANCIO</w:t>
+                <w:lang w:val="pt-BR"/>
+              </w:rPr>
+              <w:t>RONALDO BARBOSA RIBEIRO</w:t>
             </w:r>
           </w:p>
         </w:tc>
@@ -2069,10 +2496,9 @@
             <w:r>
               <w:rPr>
                 <w:sz w:val="24"/>
-                <w:szCs w:val="24"/>
-                <w:lang w:val="pt-BR"/>
-              </w:rPr>
-              <w:t>121.831.407-98</w:t>
+                <w:lang w:val="pt-BR"/>
+              </w:rPr>
+              <w:t>846.330.937-20</w:t>
             </w:r>
           </w:p>
         </w:tc>
@@ -2123,6 +2549,13 @@
                 <w:lang w:val="pt-BR"/>
               </w:rPr>
             </w:pPr>
+            <w:r>
+              <w:rPr>
+                <w:sz w:val="24"/>
+                <w:lang w:val="pt-BR"/>
+              </w:rPr>
+              <w:t>JULIO CESAR GUERRA VENANCIO</w:t>
+            </w:r>
           </w:p>
         </w:tc>
         <w:tc>
@@ -2137,10 +2570,18 @@
           </w:tcPr>
           <w:p>
             <w:pPr>
-              <w:rPr>
-                <w:lang w:val="pt-BR"/>
-              </w:rPr>
-            </w:pPr>
+              <w:jc w:val="center"/>
+              <w:rPr>
+                <w:lang w:val="pt-BR"/>
+              </w:rPr>
+            </w:pPr>
+            <w:r>
+              <w:rPr>
+                <w:sz w:val="24"/>
+                <w:lang w:val="pt-BR"/>
+              </w:rPr>
+              <w:t>121.831.407-98</w:t>
+            </w:r>
           </w:p>
         </w:tc>
         <w:tc>
@@ -2159,6 +2600,47 @@
                 <w:lang w:val="pt-BR"/>
               </w:rPr>
             </w:pPr>
+            <w:r>
+              <w:drawing>
+                <wp:anchor distT="0" distB="0" distL="0" distR="0" simplePos="0" relativeHeight="251660912" behindDoc="0" locked="0" layoutInCell="1" allowOverlap="1">
+                  <wp:simplePos x="0" y="0"/>
+                  <wp:positionH relativeFrom="column">
+                    <wp:posOffset>91440</wp:posOffset>
+                  </wp:positionH>
+                  <wp:positionV relativeFrom="paragraph">
+                    <wp:posOffset>0</wp:posOffset>
+                  </wp:positionV>
+                  <wp:extent cx="744661" cy="310896"/>
+                  <wp:effectExtent l="0" t="0" r="0" b="0"/>
+                  <wp:wrapNone/>
+                  <wp:docPr id="912" name="Assinatura Julio Cesar Guerra Venancio"/>
+                  <wp:cNvGraphicFramePr/>
+                  <a:graphic xmlns:a="http://schemas.openxmlformats.org/drawingml/2006/main" xmlns:pic="http://schemas.openxmlformats.org/drawingml/2006/picture">
+                    <a:graphicData uri="http://schemas.openxmlformats.org/drawingml/2006/picture">
+                      <pic:pic>
+                        <pic:nvPicPr>
+                          <pic:cNvPr id="0" name="sig_JUL.png"/>
+                          <pic:cNvPicPr/>
+                        </pic:nvPicPr>
+                        <pic:blipFill>
+                          <a:blip r:embed="rId23"/>
+                          <a:stretch>
+                            <a:fillRect/>
+                          </a:stretch>
+                        </pic:blipFill>
+                        <pic:spPr>
+                          <a:xfrm>
+                            <a:off x="0" y="0"/>
+                            <a:ext cx="744661" cy="310896"/>
+                          </a:xfrm>
+                          <a:prstGeom prst="rect"/>
+                        </pic:spPr>
+                      </pic:pic>
+                    </a:graphicData>
+                  </a:graphic>
+                </wp:anchor>
+              </w:drawing>
+            </w:r>
           </w:p>
         </w:tc>
       </w:tr>

</xml_diff>